<commit_message>
Run anywhere: fix the lockfile, cross-platform build script, setup guide for Windows/macOS/Linux, smoke test and CI with Oracle
</commit_message>
<xml_diff>
--- a/docs/CargoVerse-Synopsis.docx
+++ b/docs/CargoVerse-Synopsis.docx
@@ -13,13 +13,7 @@
     <w:p>
       <w:pPr/>
       <w:r>
-        <w:t xml:space="preserve">Oct 12, 2026</w:t>
-      </w:r>
-      <w:r>
-        <w:t xml:space="preserve"> · </w:t>
-      </w:r>
-      <w:r>
-        <w:t xml:space="preserve">@Shreya</w:t>
+        <w:t xml:space="preserve">Oct 14, 2026</w:t>
       </w:r>
     </w:p>
     <w:p>
@@ -45,7 +39,7 @@
     <w:p>
       <w:pPr/>
       <w:r>
-        <w:t xml:space="preserve">The database has 44 tables, 17 views, 6 PL/SQL packages, 14 triggers and 26 ready-made SQL reports. A React and Three.js front end draws the 3D city, and a Node.js server connects it to the database.</w:t>
+        <w:t xml:space="preserve">The database has 64 tables, 27 views, 10 PL/SQL packages, 26 triggers and 26 ready-made SQL reports. A Database Lab shows four things only a database can do: an UPDATE in SQL Developer changes the live city, Oracle Flashback rewinds it, Virtual Private Database limits each account to its own sites, and two real sessions demonstrate locking and deadlocks. A Smart Warehouse tracks every pallet by lot and rack bin and lets Oracle decide where to store it, which lot to pick, when to stop a cold-chain breach and what to reorder. A React and Three.js front end draws the 3D city, and a Node.js server connects it to the database.</w:t>
       </w:r>
     </w:p>
     <w:p>
@@ -775,7 +769,7 @@
     <w:p>
       <w:pPr/>
       <w:r>
-        <w:t xml:space="preserve">The schema has 44 tables in 9 areas, all in third normal form. Every table has a primary key, related tables are linked by foreign keys, and 102 check constraints keep values valid.</w:t>
+        <w:t xml:space="preserve">The schema has 44 core tables in 9 areas, plus 4 Database Lab tables and 16 Smart Warehouse tables, all in third normal form. Every table has a primary key, related tables are linked by foreign keys, and 136 check constraints keep values valid.</w:t>
       </w:r>
     </w:p>
     <w:tbl>
@@ -1905,6 +1899,935 @@
         <w:pStyle w:val="Heading2"/>
       </w:pPr>
       <w:r>
+        <w:t xml:space="preserve">Database Lab</w:t>
+      </w:r>
+    </w:p>
+    <w:p>
+      <w:pPr/>
+      <w:r>
+        <w:t xml:space="preserve">Four features show what the system can do only because it runs on Oracle. </w:t>
+      </w:r>
+      <w:r>
+        <w:rPr>
+          <w:rStyle w:val="CodeChar"/>
+        </w:rPr>
+        <w:t xml:space="preserve">npm run db:selftest</w:t>
+      </w:r>
+      <w:r>
+        <w:t xml:space="preserve"> checks all four against the database and prints PASS or FAIL.</w:t>
+      </w:r>
+    </w:p>
+    <w:tbl>
+      <w:tblPr>
+        <w:tblStyle w:val="TableGrid"/>
+        <w:tblW w:w="0" w:type="auto"/>
+        <w:tblLayout w:type="fixed"/>
+        <w:tblLook w:val="04A0" w:firstRow="1" w:lastRow="0" w:firstColumn="0" w:lastColumn="0" w:noHBand="0" w:noVBand="1"/>
+      </w:tblPr>
+      <w:tblGrid>
+        <w:gridCol w:w="3120"/>
+        <w:gridCol w:w="3120"/>
+        <w:gridCol w:w="3120"/>
+      </w:tblGrid>
+      <w:tr>
+        <w:trPr>
+          <w:tblHeader/>
+        </w:trPr>
+        <w:tc>
+          <w:tcPr>
+            <w:tcW w:w="3120" w:type="dxa"/>
+            <w:shd w:val="clear" w:color="auto" w:fill="F2F2F2"/>
+          </w:tcPr>
+          <w:p>
+            <w:pPr/>
+            <w:r>
+              <w:t xml:space="preserve">Feature</w:t>
+            </w:r>
+          </w:p>
+        </w:tc>
+        <w:tc>
+          <w:tcPr>
+            <w:tcW w:w="3120" w:type="dxa"/>
+            <w:shd w:val="clear" w:color="auto" w:fill="F2F2F2"/>
+          </w:tcPr>
+          <w:p>
+            <w:pPr/>
+            <w:r>
+              <w:t xml:space="preserve">What the user sees</w:t>
+            </w:r>
+          </w:p>
+        </w:tc>
+        <w:tc>
+          <w:tcPr>
+            <w:tcW w:w="3120" w:type="dxa"/>
+            <w:shd w:val="clear" w:color="auto" w:fill="F2F2F2"/>
+          </w:tcPr>
+          <w:p>
+            <w:pPr/>
+            <w:r>
+              <w:t xml:space="preserve">Oracle feature used</w:t>
+            </w:r>
+          </w:p>
+        </w:tc>
+      </w:tr>
+      <w:tr>
+        <w:tc>
+          <w:tcPr>
+            <w:tcW w:w="3120" w:type="dxa"/>
+          </w:tcPr>
+          <w:p>
+            <w:pPr/>
+            <w:r>
+              <w:t xml:space="preserve">Control the city from SQL</w:t>
+            </w:r>
+          </w:p>
+        </w:tc>
+        <w:tc>
+          <w:tcPr>
+            <w:tcW w:w="3120" w:type="dxa"/>
+          </w:tcPr>
+          <w:p>
+            <w:pPr/>
+            <w:r>
+              <w:t xml:space="preserve">An </w:t>
+            </w:r>
+            <w:r>
+              <w:rPr>
+                <w:rStyle w:val="CodeChar"/>
+              </w:rPr>
+              <w:t xml:space="preserve">UPDATE</w:t>
+            </w:r>
+            <w:r>
+              <w:t xml:space="preserve"> typed in SQL Developer, once committed, closes a berth, empties a shelf or speeds up the city within a second</w:t>
+            </w:r>
+          </w:p>
+        </w:tc>
+        <w:tc>
+          <w:tcPr>
+            <w:tcW w:w="3120" w:type="dxa"/>
+          </w:tcPr>
+          <w:p>
+            <w:pPr/>
+            <w:r>
+              <w:t xml:space="preserve">Row triggers check </w:t>
+            </w:r>
+            <w:r>
+              <w:rPr>
+                <w:rStyle w:val="CodeChar"/>
+              </w:rPr>
+              <w:t xml:space="preserve">SYS_CONTEXT('USERENV','MODULE')</w:t>
+            </w:r>
+            <w:r>
+              <w:t xml:space="preserve"> and queue outside changes in </w:t>
+            </w:r>
+            <w:r>
+              <w:rPr>
+                <w:rStyle w:val="CodeChar"/>
+              </w:rPr>
+              <w:t xml:space="preserve">DB_COMMANDS</w:t>
+            </w:r>
+            <w:r>
+              <w:t xml:space="preserve">; constraints still reject invalid values</w:t>
+            </w:r>
+          </w:p>
+        </w:tc>
+      </w:tr>
+      <w:tr>
+        <w:tc>
+          <w:tcPr>
+            <w:tcW w:w="3120" w:type="dxa"/>
+          </w:tcPr>
+          <w:p>
+            <w:pPr/>
+            <w:r>
+              <w:t xml:space="preserve">Time machine</w:t>
+            </w:r>
+          </w:p>
+        </w:tc>
+        <w:tc>
+          <w:tcPr>
+            <w:tcW w:w="3120" w:type="dxa"/>
+          </w:tcPr>
+          <w:p>
+            <w:pPr/>
+            <w:r>
+              <w:t xml:space="preserve">A slider rewinds every ship, truck, forklift and pallet up to 10 minutes; any row's history can be listed</w:t>
+            </w:r>
+          </w:p>
+        </w:tc>
+        <w:tc>
+          <w:tcPr>
+            <w:tcW w:w="3120" w:type="dxa"/>
+          </w:tcPr>
+          <w:p>
+            <w:pPr/>
+            <w:r>
+              <w:t xml:space="preserve">Flashback Query (</w:t>
+            </w:r>
+            <w:r>
+              <w:rPr>
+                <w:rStyle w:val="CodeChar"/>
+              </w:rPr>
+              <w:t xml:space="preserve">AS OF SCN</w:t>
+            </w:r>
+            <w:r>
+              <w:t xml:space="preserve">) on 12 tables and Flashback Versions Query, using undo data with no history tables</w:t>
+            </w:r>
+          </w:p>
+        </w:tc>
+      </w:tr>
+      <w:tr>
+        <w:tc>
+          <w:tcPr>
+            <w:tcW w:w="3120" w:type="dxa"/>
+          </w:tcPr>
+          <w:p>
+            <w:pPr/>
+            <w:r>
+              <w:t xml:space="preserve">Row-level security</w:t>
+            </w:r>
+          </w:p>
+        </w:tc>
+        <w:tc>
+          <w:tcPr>
+            <w:tcW w:w="3120" w:type="dxa"/>
+          </w:tcPr>
+          <w:p>
+            <w:pPr/>
+            <w:r>
+              <w:t xml:space="preserve">Accounts </w:t>
+            </w:r>
+            <w:r>
+              <w:rPr>
+                <w:rStyle w:val="CodeChar"/>
+              </w:rPr>
+              <w:t xml:space="preserve">CV_ADMIN</w:t>
+            </w:r>
+            <w:r>
+              <w:t xml:space="preserve">, </w:t>
+            </w:r>
+            <w:r>
+              <w:rPr>
+                <w:rStyle w:val="CodeChar"/>
+              </w:rPr>
+              <w:t xml:space="preserve">CV_ALEX</w:t>
+            </w:r>
+            <w:r>
+              <w:t xml:space="preserve">, </w:t>
+            </w:r>
+            <w:r>
+              <w:rPr>
+                <w:rStyle w:val="CodeChar"/>
+              </w:rPr>
+              <w:t xml:space="preserve">CV_MEERA</w:t>
+            </w:r>
+            <w:r>
+              <w:t xml:space="preserve"> and </w:t>
+            </w:r>
+            <w:r>
+              <w:rPr>
+                <w:rStyle w:val="CodeChar"/>
+              </w:rPr>
+              <w:t xml:space="preserve">CV_ZOE</w:t>
+            </w:r>
+            <w:r>
+              <w:t xml:space="preserve"> run the same query and each sees only their own sites</w:t>
+            </w:r>
+          </w:p>
+        </w:tc>
+        <w:tc>
+          <w:tcPr>
+            <w:tcW w:w="3120" w:type="dxa"/>
+          </w:tcPr>
+          <w:p>
+            <w:pPr/>
+            <w:r>
+              <w:t xml:space="preserve">Virtual Private Database policy (</w:t>
+            </w:r>
+            <w:r>
+              <w:rPr>
+                <w:rStyle w:val="CodeChar"/>
+              </w:rPr>
+              <w:t xml:space="preserve">DBMS_RLS</w:t>
+            </w:r>
+            <w:r>
+              <w:t xml:space="preserve">, </w:t>
+            </w:r>
+            <w:r>
+              <w:rPr>
+                <w:rStyle w:val="CodeChar"/>
+              </w:rPr>
+              <w:t xml:space="preserve">WT_SECURITY.SITE_FILTER</w:t>
+            </w:r>
+            <w:r>
+              <w:t xml:space="preserve">) on 15 tables, built from the user's site access</w:t>
+            </w:r>
+          </w:p>
+        </w:tc>
+      </w:tr>
+      <w:tr>
+        <w:tc>
+          <w:tcPr>
+            <w:tcW w:w="3120" w:type="dxa"/>
+          </w:tcPr>
+          <w:p>
+            <w:pPr/>
+            <w:r>
+              <w:t xml:space="preserve">Concurrency lab</w:t>
+            </w:r>
+          </w:p>
+        </w:tc>
+        <w:tc>
+          <w:tcPr>
+            <w:tcW w:w="3120" w:type="dxa"/>
+          </w:tcPr>
+          <w:p>
+            <w:pPr/>
+            <w:r>
+              <w:t xml:space="preserve">Double booking prevented, lost update shown, the </w:t>
+            </w:r>
+            <w:r>
+              <w:rPr>
+                <w:rStyle w:val="CodeChar"/>
+              </w:rPr>
+              <w:t xml:space="preserve">FOR UPDATE</w:t>
+            </w:r>
+            <w:r>
+              <w:t xml:space="preserve"> fix, and a deadlock, on a timeline</w:t>
+            </w:r>
+          </w:p>
+        </w:tc>
+        <w:tc>
+          <w:tcPr>
+            <w:tcW w:w="3120" w:type="dxa"/>
+          </w:tcPr>
+          <w:p>
+            <w:pPr/>
+            <w:r>
+              <w:t xml:space="preserve">Two real sessions; row locks, </w:t>
+            </w:r>
+            <w:r>
+              <w:rPr>
+                <w:rStyle w:val="CodeChar"/>
+              </w:rPr>
+              <w:t xml:space="preserve">SELECT … FOR UPDATE WAIT</w:t>
+            </w:r>
+            <w:r>
+              <w:t xml:space="preserve">, a unique key, and </w:t>
+            </w:r>
+            <w:r>
+              <w:rPr>
+                <w:rStyle w:val="CodeChar"/>
+              </w:rPr>
+              <w:t xml:space="preserve">ORA-00060</w:t>
+            </w:r>
+            <w:r>
+              <w:t xml:space="preserve"> deadlock detection</w:t>
+            </w:r>
+          </w:p>
+        </w:tc>
+      </w:tr>
+    </w:tbl>
+    <w:p>
+      <w:pPr>
+        <w:pStyle w:val="Heading2"/>
+      </w:pPr>
+      <w:r>
+        <w:t xml:space="preserve">Smart Warehouse</w:t>
+      </w:r>
+    </w:p>
+    <w:p>
+      <w:pPr/>
+      <w:r>
+        <w:t xml:space="preserve">The Smart Warehouse tracks every pallet by </w:t>
+      </w:r>
+      <w:r>
+        <w:rPr>
+          <w:b/>
+        </w:rPr>
+        <w:t xml:space="preserve">lot</w:t>
+      </w:r>
+      <w:r>
+        <w:t xml:space="preserve"> (one product received together, with an expiry date and a quality status) and by </w:t>
+      </w:r>
+      <w:r>
+        <w:rPr>
+          <w:b/>
+        </w:rPr>
+        <w:t xml:space="preserve">rack bin</w:t>
+      </w:r>
+      <w:r>
+        <w:t xml:space="preserve">, and lets Oracle make the warehouse decisions. It adds 16 tables, 10 views and the packages </w:t>
+      </w:r>
+      <w:r>
+        <w:rPr>
+          <w:rStyle w:val="CodeChar"/>
+        </w:rPr>
+        <w:t xml:space="preserve">WT_WMS</w:t>
+      </w:r>
+      <w:r>
+        <w:t xml:space="preserve"> and </w:t>
+      </w:r>
+      <w:r>
+        <w:rPr>
+          <w:rStyle w:val="CodeChar"/>
+        </w:rPr>
+        <w:t xml:space="preserve">WT_EVENTS</w:t>
+      </w:r>
+      <w:r>
+        <w:t xml:space="preserve"> (</w:t>
+      </w:r>
+      <w:r>
+        <w:rPr>
+          <w:rStyle w:val="CodeChar"/>
+        </w:rPr>
+        <w:t xml:space="preserve">10_wms.sql</w:t>
+      </w:r>
+      <w:r>
+        <w:t xml:space="preserve">); </w:t>
+      </w:r>
+      <w:r>
+        <w:rPr>
+          <w:rStyle w:val="CodeChar"/>
+        </w:rPr>
+        <w:t xml:space="preserve">12_wms_optional.sql</w:t>
+      </w:r>
+      <w:r>
+        <w:t xml:space="preserve"> adds the Oracle 21c/23ai features and skips any that the database lacks. In the app, </w:t>
+      </w:r>
+      <w:r>
+        <w:rPr>
+          <w:b/>
+        </w:rPr>
+        <w:t xml:space="preserve">Work → Warehouse</w:t>
+      </w:r>
+      <w:r>
+        <w:t xml:space="preserve"> shows each feature, and the X-ray view takes the roof off a building to show every pallet in 3D.</w:t>
+      </w:r>
+    </w:p>
+    <w:tbl>
+      <w:tblPr>
+        <w:tblStyle w:val="TableGrid"/>
+        <w:tblW w:w="0" w:type="auto"/>
+        <w:tblLayout w:type="fixed"/>
+        <w:tblLook w:val="04A0" w:firstRow="1" w:lastRow="0" w:firstColumn="0" w:lastColumn="0" w:noHBand="0" w:noVBand="1"/>
+      </w:tblPr>
+      <w:tblGrid>
+        <w:gridCol w:w="3120"/>
+        <w:gridCol w:w="3120"/>
+        <w:gridCol w:w="3120"/>
+      </w:tblGrid>
+      <w:tr>
+        <w:trPr>
+          <w:tblHeader/>
+        </w:trPr>
+        <w:tc>
+          <w:tcPr>
+            <w:tcW w:w="3120" w:type="dxa"/>
+            <w:shd w:val="clear" w:color="auto" w:fill="F2F2F2"/>
+          </w:tcPr>
+          <w:p>
+            <w:pPr/>
+            <w:r>
+              <w:t xml:space="preserve">Feature</w:t>
+            </w:r>
+          </w:p>
+        </w:tc>
+        <w:tc>
+          <w:tcPr>
+            <w:tcW w:w="3120" w:type="dxa"/>
+            <w:shd w:val="clear" w:color="auto" w:fill="F2F2F2"/>
+          </w:tcPr>
+          <w:p>
+            <w:pPr/>
+            <w:r>
+              <w:t xml:space="preserve">What it does</w:t>
+            </w:r>
+          </w:p>
+        </w:tc>
+        <w:tc>
+          <w:tcPr>
+            <w:tcW w:w="3120" w:type="dxa"/>
+            <w:shd w:val="clear" w:color="auto" w:fill="F2F2F2"/>
+          </w:tcPr>
+          <w:p>
+            <w:pPr/>
+            <w:r>
+              <w:t xml:space="preserve">Oracle feature used</w:t>
+            </w:r>
+          </w:p>
+        </w:tc>
+      </w:tr>
+      <w:tr>
+        <w:tc>
+          <w:tcPr>
+            <w:tcW w:w="3120" w:type="dxa"/>
+          </w:tcPr>
+          <w:p>
+            <w:pPr/>
+            <w:r>
+              <w:t xml:space="preserve">ABC slotting</w:t>
+            </w:r>
+          </w:p>
+        </w:tc>
+        <w:tc>
+          <w:tcPr>
+            <w:tcW w:w="3120" w:type="dxa"/>
+          </w:tcPr>
+          <w:p>
+            <w:pPr/>
+            <w:r>
+              <w:t xml:space="preserve">Fast-moving products are stored next to the dock doors, roughly halving the walk per pick</w:t>
+            </w:r>
+          </w:p>
+        </w:tc>
+        <w:tc>
+          <w:tcPr>
+            <w:tcW w:w="3120" w:type="dxa"/>
+          </w:tcPr>
+          <w:p>
+            <w:pPr/>
+            <w:r>
+              <w:rPr>
+                <w:rStyle w:val="CodeChar"/>
+              </w:rPr>
+              <w:t xml:space="preserve">RATIO_TO_REPORT</w:t>
+            </w:r>
+            <w:r>
+              <w:t xml:space="preserve">, running </w:t>
+            </w:r>
+            <w:r>
+              <w:rPr>
+                <w:rStyle w:val="CodeChar"/>
+              </w:rPr>
+              <w:t xml:space="preserve">SUM() OVER</w:t>
+            </w:r>
+          </w:p>
+        </w:tc>
+      </w:tr>
+      <w:tr>
+        <w:tc>
+          <w:tcPr>
+            <w:tcW w:w="3120" w:type="dxa"/>
+          </w:tcPr>
+          <w:p>
+            <w:pPr/>
+            <w:r>
+              <w:t xml:space="preserve">FEFO picking</w:t>
+            </w:r>
+          </w:p>
+        </w:tc>
+        <w:tc>
+          <w:tcPr>
+            <w:tcW w:w="3120" w:type="dxa"/>
+          </w:tcPr>
+          <w:p>
+            <w:pPr/>
+            <w:r>
+              <w:t xml:space="preserve">Every pick takes the lot that expires first; any exception is reported</w:t>
+            </w:r>
+          </w:p>
+        </w:tc>
+        <w:tc>
+          <w:tcPr>
+            <w:tcW w:w="3120" w:type="dxa"/>
+          </w:tcPr>
+          <w:p>
+            <w:pPr/>
+            <w:r>
+              <w:rPr>
+                <w:rStyle w:val="CodeChar"/>
+              </w:rPr>
+              <w:t xml:space="preserve">RANK() OVER (PARTITION BY … ORDER BY expiry_date)</w:t>
+            </w:r>
+          </w:p>
+        </w:tc>
+      </w:tr>
+      <w:tr>
+        <w:tc>
+          <w:tcPr>
+            <w:tcW w:w="3120" w:type="dxa"/>
+          </w:tcPr>
+          <w:p>
+            <w:pPr/>
+            <w:r>
+              <w:t xml:space="preserve">Recall trace</w:t>
+            </w:r>
+          </w:p>
+        </w:tc>
+        <w:tc>
+          <w:tcPr>
+            <w:tcW w:w="3120" w:type="dxa"/>
+          </w:tcPr>
+          <w:p>
+            <w:pPr/>
+            <w:r>
+              <w:t xml:space="preserve">One query follows a lot from the ship to every store that received it; a recall holds the stock and creates tasks</w:t>
+            </w:r>
+          </w:p>
+        </w:tc>
+        <w:tc>
+          <w:tcPr>
+            <w:tcW w:w="3120" w:type="dxa"/>
+          </w:tcPr>
+          <w:p>
+            <w:pPr/>
+            <w:r>
+              <w:t xml:space="preserve">Recursive </w:t>
+            </w:r>
+            <w:r>
+              <w:rPr>
+                <w:rStyle w:val="CodeChar"/>
+              </w:rPr>
+              <w:t xml:space="preserve">WITH</w:t>
+            </w:r>
+            <w:r>
+              <w:t xml:space="preserve"> with </w:t>
+            </w:r>
+            <w:r>
+              <w:rPr>
+                <w:rStyle w:val="CodeChar"/>
+              </w:rPr>
+              <w:t xml:space="preserve">SEARCH DEPTH FIRST</w:t>
+            </w:r>
+            <w:r>
+              <w:t xml:space="preserve"> and </w:t>
+            </w:r>
+            <w:r>
+              <w:rPr>
+                <w:rStyle w:val="CodeChar"/>
+              </w:rPr>
+              <w:t xml:space="preserve">CYCLE</w:t>
+            </w:r>
+          </w:p>
+        </w:tc>
+      </w:tr>
+      <w:tr>
+        <w:tc>
+          <w:tcPr>
+            <w:tcW w:w="3120" w:type="dxa"/>
+          </w:tcPr>
+          <w:p>
+            <w:pPr/>
+            <w:r>
+              <w:t xml:space="preserve">Cold chain</w:t>
+            </w:r>
+          </w:p>
+        </w:tc>
+        <w:tc>
+          <w:tcPr>
+            <w:tcW w:w="3120" w:type="dxa"/>
+          </w:tcPr>
+          <w:p>
+            <w:pPr/>
+            <w:r>
+              <w:t xml:space="preserve">Three out-of-range temperature readings in a row put the affected lots on hold, with no application running</w:t>
+            </w:r>
+          </w:p>
+        </w:tc>
+        <w:tc>
+          <w:tcPr>
+            <w:tcW w:w="3120" w:type="dxa"/>
+          </w:tcPr>
+          <w:p>
+            <w:pPr/>
+            <w:r>
+              <w:rPr>
+                <w:rStyle w:val="CodeChar"/>
+              </w:rPr>
+              <w:t xml:space="preserve">MATCH_RECOGNIZE</w:t>
+            </w:r>
+            <w:r>
+              <w:t xml:space="preserve">, </w:t>
+            </w:r>
+            <w:r>
+              <w:rPr>
+                <w:rStyle w:val="CodeChar"/>
+              </w:rPr>
+              <w:t xml:space="preserve">DBMS_SCHEDULER</w:t>
+            </w:r>
+            <w:r>
+              <w:t xml:space="preserve"> job, interval-partitioned readings</w:t>
+            </w:r>
+          </w:p>
+        </w:tc>
+      </w:tr>
+      <w:tr>
+        <w:tc>
+          <w:tcPr>
+            <w:tcW w:w="3120" w:type="dxa"/>
+          </w:tcPr>
+          <w:p>
+            <w:pPr/>
+            <w:r>
+              <w:t xml:space="preserve">Tamper-proof ledger</w:t>
+            </w:r>
+          </w:p>
+        </w:tc>
+        <w:tc>
+          <w:tcPr>
+            <w:tcW w:w="3120" w:type="dxa"/>
+          </w:tcPr>
+          <w:p>
+            <w:pPr/>
+            <w:r>
+              <w:t xml:space="preserve">Stock movements cannot be changed or deleted, even by the schema owner</w:t>
+            </w:r>
+          </w:p>
+        </w:tc>
+        <w:tc>
+          <w:tcPr>
+            <w:tcW w:w="3120" w:type="dxa"/>
+          </w:tcPr>
+          <w:p>
+            <w:pPr/>
+            <w:r>
+              <w:t xml:space="preserve">Blockchain table, </w:t>
+            </w:r>
+            <w:r>
+              <w:rPr>
+                <w:rStyle w:val="CodeChar"/>
+              </w:rPr>
+              <w:t xml:space="preserve">DBMS_BLOCKCHAIN_TABLE.VERIFY_ROWS</w:t>
+            </w:r>
+          </w:p>
+        </w:tc>
+      </w:tr>
+      <w:tr>
+        <w:tc>
+          <w:tcPr>
+            <w:tcW w:w="3120" w:type="dxa"/>
+          </w:tcPr>
+          <w:p>
+            <w:pPr/>
+            <w:r>
+              <w:t xml:space="preserve">Forecast and reorder</w:t>
+            </w:r>
+          </w:p>
+        </w:tc>
+        <w:tc>
+          <w:tcPr>
+            <w:tcW w:w="3120" w:type="dxa"/>
+          </w:tcPr>
+          <w:p>
+            <w:pPr/>
+            <w:r>
+              <w:t xml:space="preserve">14-day demand forecast, reorder point, safety stock and order size per product</w:t>
+            </w:r>
+          </w:p>
+        </w:tc>
+        <w:tc>
+          <w:tcPr>
+            <w:tcW w:w="3120" w:type="dxa"/>
+          </w:tcPr>
+          <w:p>
+            <w:pPr/>
+            <w:r>
+              <w:rPr>
+                <w:rStyle w:val="CodeChar"/>
+              </w:rPr>
+              <w:t xml:space="preserve">MODEL</w:t>
+            </w:r>
+            <w:r>
+              <w:t xml:space="preserve"> clause, </w:t>
+            </w:r>
+            <w:r>
+              <w:rPr>
+                <w:rStyle w:val="CodeChar"/>
+              </w:rPr>
+              <w:t xml:space="preserve">REGR_SLOPE</w:t>
+            </w:r>
+            <w:r>
+              <w:t xml:space="preserve">, </w:t>
+            </w:r>
+            <w:r>
+              <w:rPr>
+                <w:rStyle w:val="CodeChar"/>
+              </w:rPr>
+              <w:t xml:space="preserve">STDDEV</w:t>
+            </w:r>
+          </w:p>
+        </w:tc>
+      </w:tr>
+      <w:tr>
+        <w:tc>
+          <w:tcPr>
+            <w:tcW w:w="3120" w:type="dxa"/>
+          </w:tcPr>
+          <w:p>
+            <w:pPr/>
+            <w:r>
+              <w:t xml:space="preserve">GS1 pallet labels</w:t>
+            </w:r>
+          </w:p>
+        </w:tc>
+        <w:tc>
+          <w:tcPr>
+            <w:tcW w:w="3120" w:type="dxa"/>
+          </w:tcPr>
+          <w:p>
+            <w:pPr/>
+            <w:r>
+              <w:t xml:space="preserve">18-digit SSCC barcodes; a wrong check digit is refused</w:t>
+            </w:r>
+          </w:p>
+        </w:tc>
+        <w:tc>
+          <w:tcPr>
+            <w:tcW w:w="3120" w:type="dxa"/>
+          </w:tcPr>
+          <w:p>
+            <w:pPr/>
+            <w:r>
+              <w:rPr>
+                <w:rStyle w:val="CodeChar"/>
+              </w:rPr>
+              <w:t xml:space="preserve">CHECK</w:t>
+            </w:r>
+            <w:r>
+              <w:t xml:space="preserve"> constraint computing the mod-10 digit</w:t>
+            </w:r>
+          </w:p>
+        </w:tc>
+      </w:tr>
+      <w:tr>
+        <w:tc>
+          <w:tcPr>
+            <w:tcW w:w="3120" w:type="dxa"/>
+          </w:tcPr>
+          <w:p>
+            <w:pPr/>
+            <w:r>
+              <w:t xml:space="preserve">Event stream</w:t>
+            </w:r>
+          </w:p>
+        </w:tc>
+        <w:tc>
+          <w:tcPr>
+            <w:tcW w:w="3120" w:type="dxa"/>
+          </w:tcPr>
+          <w:p>
+            <w:pPr/>
+            <w:r>
+              <w:t xml:space="preserve">Receipts, breaches and recalls are published only when the transaction commits</w:t>
+            </w:r>
+          </w:p>
+        </w:tc>
+        <w:tc>
+          <w:tcPr>
+            <w:tcW w:w="3120" w:type="dxa"/>
+          </w:tcPr>
+          <w:p>
+            <w:pPr/>
+            <w:r>
+              <w:t xml:space="preserve">Transactional Event Queue (</w:t>
+            </w:r>
+            <w:r>
+              <w:rPr>
+                <w:rStyle w:val="CodeChar"/>
+              </w:rPr>
+              <w:t xml:space="preserve">DBMS_AQ</w:t>
+            </w:r>
+            <w:r>
+              <w:t xml:space="preserve">)</w:t>
+            </w:r>
+          </w:p>
+        </w:tc>
+      </w:tr>
+      <w:tr>
+        <w:tc>
+          <w:tcPr>
+            <w:tcW w:w="3120" w:type="dxa"/>
+          </w:tcPr>
+          <w:p>
+            <w:pPr/>
+            <w:r>
+              <w:t xml:space="preserve">Shortest pick route</w:t>
+            </w:r>
+          </w:p>
+        </w:tc>
+        <w:tc>
+          <w:tcPr>
+            <w:tcW w:w="3120" w:type="dxa"/>
+          </w:tcPr>
+          <w:p>
+            <w:pPr/>
+            <w:r>
+              <w:t xml:space="preserve">The walking route through the aisles for a pick list</w:t>
+            </w:r>
+          </w:p>
+        </w:tc>
+        <w:tc>
+          <w:tcPr>
+            <w:tcW w:w="3120" w:type="dxa"/>
+          </w:tcPr>
+          <w:p>
+            <w:pPr/>
+            <w:r>
+              <w:t xml:space="preserve">Dijkstra in PL/SQL, SQL property graph with </w:t>
+            </w:r>
+            <w:r>
+              <w:rPr>
+                <w:rStyle w:val="CodeChar"/>
+              </w:rPr>
+              <w:t xml:space="preserve">GRAPH_TABLE</w:t>
+            </w:r>
+          </w:p>
+        </w:tc>
+      </w:tr>
+      <w:tr>
+        <w:tc>
+          <w:tcPr>
+            <w:tcW w:w="3120" w:type="dxa"/>
+          </w:tcPr>
+          <w:p>
+            <w:pPr/>
+            <w:r>
+              <w:t xml:space="preserve">Semantic search</w:t>
+            </w:r>
+          </w:p>
+        </w:tc>
+        <w:tc>
+          <w:tcPr>
+            <w:tcW w:w="3120" w:type="dxa"/>
+          </w:tcPr>
+          <w:p>
+            <w:pPr/>
+            <w:r>
+              <w:t xml:space="preserve">Damage reports found by meaning, not exact words</w:t>
+            </w:r>
+          </w:p>
+        </w:tc>
+        <w:tc>
+          <w:tcPr>
+            <w:tcW w:w="3120" w:type="dxa"/>
+          </w:tcPr>
+          <w:p>
+            <w:pPr/>
+            <w:r>
+              <w:rPr>
+                <w:rStyle w:val="CodeChar"/>
+              </w:rPr>
+              <w:t xml:space="preserve">VECTOR(384)</w:t>
+            </w:r>
+            <w:r>
+              <w:t xml:space="preserve">, </w:t>
+            </w:r>
+            <w:r>
+              <w:rPr>
+                <w:rStyle w:val="CodeChar"/>
+              </w:rPr>
+              <w:t xml:space="preserve">VECTOR_DISTANCE</w:t>
+            </w:r>
+          </w:p>
+        </w:tc>
+      </w:tr>
+    </w:tbl>
+    <w:p>
+      <w:pPr>
+        <w:pStyle w:val="Heading2"/>
+      </w:pPr>
+      <w:r>
         <w:t xml:space="preserve">Methodology and implementation</w:t>
       </w:r>
     </w:p>
@@ -2077,6 +3000,51 @@
       </w:r>
     </w:p>
     <w:p>
+      <w:pPr>
+        <w:pStyle w:val="ListParagraph"/>
+        <w:numPr>
+          <w:ilvl w:val="0"/>
+          <w:numId w:val="8"/>
+        </w:numPr>
+      </w:pPr>
+      <w:r>
+        <w:rPr>
+          <w:b/>
+        </w:rPr>
+        <w:t xml:space="preserve">Smart Warehouse:</w:t>
+      </w:r>
+      <w:r>
+        <w:t xml:space="preserve"> added lots, rack bins, sensors and the aisle graph (</w:t>
+      </w:r>
+      <w:r>
+        <w:rPr>
+          <w:rStyle w:val="CodeChar"/>
+        </w:rPr>
+        <w:t xml:space="preserve">10_wms.sql</w:t>
+      </w:r>
+      <w:r>
+        <w:t xml:space="preserve">, </w:t>
+      </w:r>
+      <w:r>
+        <w:rPr>
+          <w:rStyle w:val="CodeChar"/>
+        </w:rPr>
+        <w:t xml:space="preserve">12_wms_optional.sql</w:t>
+      </w:r>
+      <w:r>
+        <w:t xml:space="preserve">), the warehouse engine on the server, and the X-ray view; </w:t>
+      </w:r>
+      <w:r>
+        <w:rPr>
+          <w:rStyle w:val="CodeChar"/>
+        </w:rPr>
+        <w:t xml:space="preserve">npm run db:selftest</w:t>
+      </w:r>
+      <w:r>
+        <w:t xml:space="preserve"> grew to about 30 checks.</w:t>
+      </w:r>
+    </w:p>
+    <w:p>
       <w:pPr/>
       <w:r>
         <w:t xml:space="preserve">Setup is scripted: </w:t>
@@ -2222,7 +3190,7 @@
         <w:t xml:space="preserve">Size:</w:t>
       </w:r>
       <w:r>
-        <w:t xml:space="preserve"> about 19,000 lines of SQL, PL/SQL and TypeScript, with 44 tables, 17 views, 6 packages, 14 triggers and 26 reports.</w:t>
+        <w:t xml:space="preserve"> about 30,700 lines of SQL, PL/SQL and TypeScript, with 64 tables, 27 views, 10 packages, 26 triggers and 26 reports.</w:t>
       </w:r>
     </w:p>
     <w:p>
@@ -2242,7 +3210,7 @@
         </w:numPr>
       </w:pPr>
       <w:r>
-        <w:t xml:space="preserve">Connect to real devices: barcode or RFID scanners and GPS trackers in place of the simulation.</w:t>
+        <w:t xml:space="preserve">Connect to real devices: RFID gates, IoT temperature sensors and GPS trackers in place of the simulation.</w:t>
       </w:r>
     </w:p>
     <w:p>
@@ -2266,7 +3234,7 @@
         </w:numPr>
       </w:pPr>
       <w:r>
-        <w:t xml:space="preserve">Forecast demand and stock levels from the stored history.</w:t>
+        <w:t xml:space="preserve">Train Oracle Machine Learning models inside the database to improve the demand forecast.</w:t>
       </w:r>
     </w:p>
     <w:p>

</xml_diff>